<commit_message>
feat(server): support MCP UTF-8 text and structured Office editing
</commit_message>
<xml_diff>
--- a/apps/server/internal/office/templates/en-US/new.docx
+++ b/apps/server/internal/office/templates/en-US/new.docx
@@ -19,13 +19,13 @@
 
 <file path=word/styles.xml><?xml version="1.0" encoding="utf-8"?>
 <w:styles xmlns:mc="http://schemas.openxmlformats.org/markup-compatibility/2006" xmlns:r="http://schemas.openxmlformats.org/officeDocument/2006/relationships" xmlns:w="http://schemas.openxmlformats.org/wordprocessingml/2006/main" xmlns:w14="http://schemas.microsoft.com/office/word/2010/wordml" mc:Ignorable="w14">
-  <w:docDefaults>
+  <w:docDefaults xmlns:mc="http://schemas.openxmlformats.org/markup-compatibility/2006" xmlns:r="http://schemas.openxmlformats.org/officeDocument/2006/relationships" xmlns:w="http://schemas.openxmlformats.org/wordprocessingml/2006/main" xmlns:w14="http://schemas.microsoft.com/office/word/2010/wordml">
     <w:rPrDefault>
       <w:rPr>
-        <w:rFonts w:asciiTheme="minorHAnsi" w:eastAsiaTheme="minorHAnsi" w:hAnsiTheme="minorHAnsi" w:cstheme="minorBidi"/>
+        <w:rFonts w:asciiTheme="minorHAnsi" w:hAnsiTheme="minorHAnsi" w:eastAsiaTheme="minorHAnsi" w:cstheme="minorBidi"/>
         <w:sz w:val="22"/>
-        <w:lang w:val="en-US" w:bidi="ar-SA" w:eastAsia="en-US"/>
-        <w:szCs w:val="22"/>
+        <w:szCs xmlns:w="http://schemas.openxmlformats.org/wordprocessingml/2006/main" w:val="22"/>
+        <w:lang w:val="en-US" w:eastAsia="en-US" w:bidi="ar-SA"/>
       </w:rPr>
     </w:rPrDefault>
     <w:pPrDefault>
@@ -34,9 +34,9 @@
       </w:pPr>
     </w:pPrDefault>
   </w:docDefaults>
-  <w:latentStyles w:defLockedState="0" w:defUIPriority="99" w:defSemiHidden="1" w:defUnhideWhenUsed="1" w:defQFormat="0" w:count="267">
-    <w:lsdException w:name="Normal" w:semiHidden="0" w:uiPriority="0" w:unhideWhenUsed="0" w:qFormat="1"/>
-    <w:lsdException w:name="heading 1" w:semiHidden="0" w:uiPriority="9" w:unhideWhenUsed="0" w:qFormat="1"/>
+  <w:latentStyles xmlns:mc="http://schemas.openxmlformats.org/markup-compatibility/2006" xmlns:r="http://schemas.openxmlformats.org/officeDocument/2006/relationships" xmlns:w="http://schemas.openxmlformats.org/wordprocessingml/2006/main" xmlns:w14="http://schemas.microsoft.com/office/word/2010/wordml" w:defLockedState="0" w:defUIPriority="99" w:defSemiHidden="1" w:defUnhideWhenUsed="1" w:defQFormat="0" w:count="267">
+    <w:lsdException w:name="Normal" w:uiPriority="0" w:semiHidden="0" w:unhideWhenUsed="0" w:qFormat="1"/>
+    <w:lsdException w:name="heading 1" w:uiPriority="9" w:semiHidden="0" w:unhideWhenUsed="0" w:qFormat="1"/>
     <w:lsdException w:name="heading 2" w:uiPriority="9" w:qFormat="1"/>
     <w:lsdException w:name="heading 3" w:uiPriority="9" w:qFormat="1"/>
     <w:lsdException w:name="heading 4" w:uiPriority="9" w:qFormat="1"/>
@@ -56,129 +56,129 @@
     <w:lsdException w:name="toc 9" w:uiPriority="39"/>
     <w:lsdException w:name="footer" w:uiPriority="0" w:qFormat="1"/>
     <w:lsdException w:name="caption" w:uiPriority="35" w:qFormat="1"/>
-    <w:lsdException w:name="Title" w:semiHidden="0" w:uiPriority="10" w:unhideWhenUsed="0" w:qFormat="1"/>
+    <w:lsdException w:name="Title" w:uiPriority="10" w:semiHidden="0" w:unhideWhenUsed="0" w:qFormat="1"/>
     <w:lsdException w:name="Default Paragraph Font" w:uiPriority="1"/>
-    <w:lsdException w:name="Subtitle" w:semiHidden="0" w:uiPriority="11" w:unhideWhenUsed="0" w:qFormat="1"/>
-    <w:lsdException w:name="Strong" w:semiHidden="0" w:uiPriority="22" w:unhideWhenUsed="0" w:qFormat="1"/>
-    <w:lsdException w:name="Emphasis" w:semiHidden="0" w:uiPriority="20" w:unhideWhenUsed="0" w:qFormat="1"/>
-    <w:lsdException w:name="Table Grid" w:semiHidden="0" w:uiPriority="59" w:unhideWhenUsed="0"/>
+    <w:lsdException w:name="Subtitle" w:uiPriority="11" w:semiHidden="0" w:unhideWhenUsed="0" w:qFormat="1"/>
+    <w:lsdException w:name="Strong" w:uiPriority="22" w:semiHidden="0" w:unhideWhenUsed="0" w:qFormat="1"/>
+    <w:lsdException w:name="Emphasis" w:uiPriority="20" w:semiHidden="0" w:unhideWhenUsed="0" w:qFormat="1"/>
+    <w:lsdException w:name="Table Grid" w:uiPriority="59" w:semiHidden="0" w:unhideWhenUsed="0"/>
     <w:lsdException w:name="Placeholder Text" w:unhideWhenUsed="0"/>
-    <w:lsdException w:name="No Spacing" w:semiHidden="0" w:uiPriority="1" w:unhideWhenUsed="0" w:qFormat="1"/>
-    <w:lsdException w:name="Light Shading" w:semiHidden="0" w:uiPriority="60" w:unhideWhenUsed="0"/>
-    <w:lsdException w:name="Light List" w:semiHidden="0" w:uiPriority="61" w:unhideWhenUsed="0"/>
-    <w:lsdException w:name="Light Grid" w:semiHidden="0" w:uiPriority="62" w:unhideWhenUsed="0"/>
-    <w:lsdException w:name="Medium Shading 1" w:semiHidden="0" w:uiPriority="63" w:unhideWhenUsed="0"/>
-    <w:lsdException w:name="Medium Shading 2" w:semiHidden="0" w:uiPriority="64" w:unhideWhenUsed="0"/>
-    <w:lsdException w:name="Medium List 1" w:semiHidden="0" w:uiPriority="65" w:unhideWhenUsed="0"/>
-    <w:lsdException w:name="Medium List 2" w:semiHidden="0" w:uiPriority="66" w:unhideWhenUsed="0"/>
-    <w:lsdException w:name="Medium Grid 1" w:semiHidden="0" w:uiPriority="67" w:unhideWhenUsed="0"/>
-    <w:lsdException w:name="Medium Grid 2" w:semiHidden="0" w:uiPriority="68" w:unhideWhenUsed="0"/>
-    <w:lsdException w:name="Medium Grid 3" w:semiHidden="0" w:uiPriority="69" w:unhideWhenUsed="0"/>
-    <w:lsdException w:name="Dark List" w:semiHidden="0" w:uiPriority="70" w:unhideWhenUsed="0"/>
-    <w:lsdException w:name="Colorful Shading" w:semiHidden="0" w:uiPriority="71" w:unhideWhenUsed="0"/>
-    <w:lsdException w:name="Colorful List" w:semiHidden="0" w:uiPriority="72" w:unhideWhenUsed="0"/>
-    <w:lsdException w:name="Colorful Grid" w:semiHidden="0" w:uiPriority="73" w:unhideWhenUsed="0"/>
-    <w:lsdException w:name="Light Shading Accent 1" w:semiHidden="0" w:uiPriority="60" w:unhideWhenUsed="0"/>
-    <w:lsdException w:name="Light List Accent 1" w:semiHidden="0" w:uiPriority="61" w:unhideWhenUsed="0"/>
-    <w:lsdException w:name="Light Grid Accent 1" w:semiHidden="0" w:uiPriority="62" w:unhideWhenUsed="0"/>
-    <w:lsdException w:name="Medium Shading 1 Accent 1" w:semiHidden="0" w:uiPriority="63" w:unhideWhenUsed="0"/>
-    <w:lsdException w:name="Medium Shading 2 Accent 1" w:semiHidden="0" w:uiPriority="64" w:unhideWhenUsed="0"/>
-    <w:lsdException w:name="Medium List 1 Accent 1" w:semiHidden="0" w:uiPriority="65" w:unhideWhenUsed="0"/>
+    <w:lsdException w:name="No Spacing" w:uiPriority="1" w:semiHidden="0" w:unhideWhenUsed="0" w:qFormat="1"/>
+    <w:lsdException w:name="Light Shading" w:uiPriority="60" w:semiHidden="0" w:unhideWhenUsed="0"/>
+    <w:lsdException w:name="Light List" w:uiPriority="61" w:semiHidden="0" w:unhideWhenUsed="0"/>
+    <w:lsdException w:name="Light Grid" w:uiPriority="62" w:semiHidden="0" w:unhideWhenUsed="0"/>
+    <w:lsdException w:name="Medium Shading 1" w:uiPriority="63" w:semiHidden="0" w:unhideWhenUsed="0"/>
+    <w:lsdException w:name="Medium Shading 2" w:uiPriority="64" w:semiHidden="0" w:unhideWhenUsed="0"/>
+    <w:lsdException w:name="Medium List 1" w:uiPriority="65" w:semiHidden="0" w:unhideWhenUsed="0"/>
+    <w:lsdException w:name="Medium List 2" w:uiPriority="66" w:semiHidden="0" w:unhideWhenUsed="0"/>
+    <w:lsdException w:name="Medium Grid 1" w:uiPriority="67" w:semiHidden="0" w:unhideWhenUsed="0"/>
+    <w:lsdException w:name="Medium Grid 2" w:uiPriority="68" w:semiHidden="0" w:unhideWhenUsed="0"/>
+    <w:lsdException w:name="Medium Grid 3" w:uiPriority="69" w:semiHidden="0" w:unhideWhenUsed="0"/>
+    <w:lsdException w:name="Dark List" w:uiPriority="70" w:semiHidden="0" w:unhideWhenUsed="0"/>
+    <w:lsdException w:name="Colorful Shading" w:uiPriority="71" w:semiHidden="0" w:unhideWhenUsed="0"/>
+    <w:lsdException w:name="Colorful List" w:uiPriority="72" w:semiHidden="0" w:unhideWhenUsed="0"/>
+    <w:lsdException w:name="Colorful Grid" w:uiPriority="73" w:semiHidden="0" w:unhideWhenUsed="0"/>
+    <w:lsdException w:name="Light Shading Accent 1" w:uiPriority="60" w:semiHidden="0" w:unhideWhenUsed="0"/>
+    <w:lsdException w:name="Light List Accent 1" w:uiPriority="61" w:semiHidden="0" w:unhideWhenUsed="0"/>
+    <w:lsdException w:name="Light Grid Accent 1" w:uiPriority="62" w:semiHidden="0" w:unhideWhenUsed="0"/>
+    <w:lsdException w:name="Medium Shading 1 Accent 1" w:uiPriority="63" w:semiHidden="0" w:unhideWhenUsed="0"/>
+    <w:lsdException w:name="Medium Shading 2 Accent 1" w:uiPriority="64" w:semiHidden="0" w:unhideWhenUsed="0"/>
+    <w:lsdException w:name="Medium List 1 Accent 1" w:uiPriority="65" w:semiHidden="0" w:unhideWhenUsed="0"/>
     <w:lsdException w:name="Revision" w:unhideWhenUsed="0"/>
-    <w:lsdException w:name="List Paragraph" w:semiHidden="0" w:uiPriority="34" w:unhideWhenUsed="0" w:qFormat="1"/>
-    <w:lsdException w:name="Quote" w:semiHidden="0" w:uiPriority="29" w:unhideWhenUsed="0" w:qFormat="1"/>
-    <w:lsdException w:name="Intense Quote" w:semiHidden="0" w:uiPriority="30" w:unhideWhenUsed="0" w:qFormat="1"/>
-    <w:lsdException w:name="Medium List 2 Accent 1" w:semiHidden="0" w:uiPriority="66" w:unhideWhenUsed="0"/>
-    <w:lsdException w:name="Medium Grid 1 Accent 1" w:semiHidden="0" w:uiPriority="67" w:unhideWhenUsed="0"/>
-    <w:lsdException w:name="Medium Grid 2 Accent 1" w:semiHidden="0" w:uiPriority="68" w:unhideWhenUsed="0"/>
-    <w:lsdException w:name="Medium Grid 3 Accent 1" w:semiHidden="0" w:uiPriority="69" w:unhideWhenUsed="0"/>
-    <w:lsdException w:name="Dark List Accent 1" w:semiHidden="0" w:uiPriority="70" w:unhideWhenUsed="0"/>
-    <w:lsdException w:name="Colorful Shading Accent 1" w:semiHidden="0" w:uiPriority="71" w:unhideWhenUsed="0"/>
-    <w:lsdException w:name="Colorful List Accent 1" w:semiHidden="0" w:uiPriority="72" w:unhideWhenUsed="0"/>
-    <w:lsdException w:name="Colorful Grid Accent 1" w:semiHidden="0" w:uiPriority="73" w:unhideWhenUsed="0"/>
-    <w:lsdException w:name="Light Shading Accent 2" w:semiHidden="0" w:uiPriority="60" w:unhideWhenUsed="0"/>
-    <w:lsdException w:name="Light List Accent 2" w:semiHidden="0" w:uiPriority="61" w:unhideWhenUsed="0"/>
-    <w:lsdException w:name="Light Grid Accent 2" w:semiHidden="0" w:uiPriority="62" w:unhideWhenUsed="0"/>
-    <w:lsdException w:name="Medium Shading 1 Accent 2" w:semiHidden="0" w:uiPriority="63" w:unhideWhenUsed="0"/>
-    <w:lsdException w:name="Medium Shading 2 Accent 2" w:semiHidden="0" w:uiPriority="64" w:unhideWhenUsed="0"/>
-    <w:lsdException w:name="Medium List 1 Accent 2" w:semiHidden="0" w:uiPriority="65" w:unhideWhenUsed="0"/>
-    <w:lsdException w:name="Medium List 2 Accent 2" w:semiHidden="0" w:uiPriority="66" w:unhideWhenUsed="0"/>
-    <w:lsdException w:name="Medium Grid 1 Accent 2" w:semiHidden="0" w:uiPriority="67" w:unhideWhenUsed="0"/>
-    <w:lsdException w:name="Medium Grid 2 Accent 2" w:semiHidden="0" w:uiPriority="68" w:unhideWhenUsed="0"/>
-    <w:lsdException w:name="Medium Grid 3 Accent 2" w:semiHidden="0" w:uiPriority="69" w:unhideWhenUsed="0"/>
-    <w:lsdException w:name="Dark List Accent 2" w:semiHidden="0" w:uiPriority="70" w:unhideWhenUsed="0"/>
-    <w:lsdException w:name="Colorful Shading Accent 2" w:semiHidden="0" w:uiPriority="71" w:unhideWhenUsed="0"/>
-    <w:lsdException w:name="Colorful List Accent 2" w:semiHidden="0" w:uiPriority="72" w:unhideWhenUsed="0"/>
-    <w:lsdException w:name="Colorful Grid Accent 2" w:semiHidden="0" w:uiPriority="73" w:unhideWhenUsed="0"/>
-    <w:lsdException w:name="Light Shading Accent 3" w:semiHidden="0" w:uiPriority="60" w:unhideWhenUsed="0"/>
-    <w:lsdException w:name="Light List Accent 3" w:semiHidden="0" w:uiPriority="61" w:unhideWhenUsed="0"/>
-    <w:lsdException w:name="Light Grid Accent 3" w:semiHidden="0" w:uiPriority="62" w:unhideWhenUsed="0"/>
-    <w:lsdException w:name="Medium Shading 1 Accent 3" w:semiHidden="0" w:uiPriority="63" w:unhideWhenUsed="0"/>
-    <w:lsdException w:name="Medium Shading 2 Accent 3" w:semiHidden="0" w:uiPriority="64" w:unhideWhenUsed="0"/>
-    <w:lsdException w:name="Medium List 1 Accent 3" w:semiHidden="0" w:uiPriority="65" w:unhideWhenUsed="0"/>
-    <w:lsdException w:name="Medium List 2 Accent 3" w:semiHidden="0" w:uiPriority="66" w:unhideWhenUsed="0"/>
-    <w:lsdException w:name="Medium Grid 1 Accent 3" w:semiHidden="0" w:uiPriority="67" w:unhideWhenUsed="0"/>
-    <w:lsdException w:name="Medium Grid 2 Accent 3" w:semiHidden="0" w:uiPriority="68" w:unhideWhenUsed="0"/>
-    <w:lsdException w:name="Medium Grid 3 Accent 3" w:semiHidden="0" w:uiPriority="69" w:unhideWhenUsed="0"/>
-    <w:lsdException w:name="Dark List Accent 3" w:semiHidden="0" w:uiPriority="70" w:unhideWhenUsed="0"/>
-    <w:lsdException w:name="Colorful Shading Accent 3" w:semiHidden="0" w:uiPriority="71" w:unhideWhenUsed="0"/>
-    <w:lsdException w:name="Colorful List Accent 3" w:semiHidden="0" w:uiPriority="72" w:unhideWhenUsed="0"/>
-    <w:lsdException w:name="Colorful Grid Accent 3" w:semiHidden="0" w:uiPriority="73" w:unhideWhenUsed="0"/>
-    <w:lsdException w:name="Light Shading Accent 4" w:semiHidden="0" w:uiPriority="60" w:unhideWhenUsed="0"/>
-    <w:lsdException w:name="Light List Accent 4" w:semiHidden="0" w:uiPriority="61" w:unhideWhenUsed="0"/>
-    <w:lsdException w:name="Light Grid Accent 4" w:semiHidden="0" w:uiPriority="62" w:unhideWhenUsed="0"/>
-    <w:lsdException w:name="Medium Shading 1 Accent 4" w:semiHidden="0" w:uiPriority="63" w:unhideWhenUsed="0"/>
-    <w:lsdException w:name="Medium Shading 2 Accent 4" w:semiHidden="0" w:uiPriority="64" w:unhideWhenUsed="0"/>
-    <w:lsdException w:name="Medium List 1 Accent 4" w:semiHidden="0" w:uiPriority="65" w:unhideWhenUsed="0"/>
-    <w:lsdException w:name="Medium List 2 Accent 4" w:semiHidden="0" w:uiPriority="66" w:unhideWhenUsed="0"/>
-    <w:lsdException w:name="Medium Grid 1 Accent 4" w:semiHidden="0" w:uiPriority="67" w:unhideWhenUsed="0"/>
-    <w:lsdException w:name="Medium Grid 2 Accent 4" w:semiHidden="0" w:uiPriority="68" w:unhideWhenUsed="0"/>
-    <w:lsdException w:name="Medium Grid 3 Accent 4" w:semiHidden="0" w:uiPriority="69" w:unhideWhenUsed="0"/>
-    <w:lsdException w:name="Dark List Accent 4" w:semiHidden="0" w:uiPriority="70" w:unhideWhenUsed="0"/>
-    <w:lsdException w:name="Colorful Shading Accent 4" w:semiHidden="0" w:uiPriority="71" w:unhideWhenUsed="0"/>
-    <w:lsdException w:name="Colorful List Accent 4" w:semiHidden="0" w:uiPriority="72" w:unhideWhenUsed="0"/>
-    <w:lsdException w:name="Colorful Grid Accent 4" w:semiHidden="0" w:uiPriority="73" w:unhideWhenUsed="0"/>
-    <w:lsdException w:name="Light Shading Accent 5" w:semiHidden="0" w:uiPriority="60" w:unhideWhenUsed="0"/>
-    <w:lsdException w:name="Light List Accent 5" w:semiHidden="0" w:uiPriority="61" w:unhideWhenUsed="0"/>
-    <w:lsdException w:name="Light Grid Accent 5" w:semiHidden="0" w:uiPriority="62" w:unhideWhenUsed="0"/>
-    <w:lsdException w:name="Medium Shading 1 Accent 5" w:semiHidden="0" w:uiPriority="63" w:unhideWhenUsed="0"/>
-    <w:lsdException w:name="Medium Shading 2 Accent 5" w:semiHidden="0" w:uiPriority="64" w:unhideWhenUsed="0"/>
-    <w:lsdException w:name="Medium List 1 Accent 5" w:semiHidden="0" w:uiPriority="65" w:unhideWhenUsed="0"/>
-    <w:lsdException w:name="Medium List 2 Accent 5" w:semiHidden="0" w:uiPriority="66" w:unhideWhenUsed="0"/>
-    <w:lsdException w:name="Medium Grid 1 Accent 5" w:semiHidden="0" w:uiPriority="67" w:unhideWhenUsed="0"/>
-    <w:lsdException w:name="Medium Grid 2 Accent 5" w:semiHidden="0" w:uiPriority="68" w:unhideWhenUsed="0"/>
-    <w:lsdException w:name="Medium Grid 3 Accent 5" w:semiHidden="0" w:uiPriority="69" w:unhideWhenUsed="0"/>
-    <w:lsdException w:name="Dark List Accent 5" w:semiHidden="0" w:uiPriority="70" w:unhideWhenUsed="0"/>
-    <w:lsdException w:name="Colorful Shading Accent 5" w:semiHidden="0" w:uiPriority="71" w:unhideWhenUsed="0"/>
-    <w:lsdException w:name="Colorful List Accent 5" w:semiHidden="0" w:uiPriority="72" w:unhideWhenUsed="0"/>
-    <w:lsdException w:name="Colorful Grid Accent 5" w:semiHidden="0" w:uiPriority="73" w:unhideWhenUsed="0"/>
-    <w:lsdException w:name="Light Shading Accent 6" w:semiHidden="0" w:uiPriority="60" w:unhideWhenUsed="0"/>
-    <w:lsdException w:name="Light List Accent 6" w:semiHidden="0" w:uiPriority="61" w:unhideWhenUsed="0"/>
-    <w:lsdException w:name="Light Grid Accent 6" w:semiHidden="0" w:uiPriority="62" w:unhideWhenUsed="0"/>
-    <w:lsdException w:name="Medium Shading 1 Accent 6" w:semiHidden="0" w:uiPriority="63" w:unhideWhenUsed="0"/>
-    <w:lsdException w:name="Medium Shading 2 Accent 6" w:semiHidden="0" w:uiPriority="64" w:unhideWhenUsed="0"/>
-    <w:lsdException w:name="Medium List 1 Accent 6" w:semiHidden="0" w:uiPriority="65" w:unhideWhenUsed="0"/>
-    <w:lsdException w:name="Medium List 2 Accent 6" w:semiHidden="0" w:uiPriority="66" w:unhideWhenUsed="0"/>
-    <w:lsdException w:name="Medium Grid 1 Accent 6" w:semiHidden="0" w:uiPriority="67" w:unhideWhenUsed="0"/>
-    <w:lsdException w:name="Medium Grid 2 Accent 6" w:semiHidden="0" w:uiPriority="68" w:unhideWhenUsed="0"/>
-    <w:lsdException w:name="Medium Grid 3 Accent 6" w:semiHidden="0" w:uiPriority="69" w:unhideWhenUsed="0"/>
-    <w:lsdException w:name="Dark List Accent 6" w:semiHidden="0" w:uiPriority="70" w:unhideWhenUsed="0"/>
-    <w:lsdException w:name="Colorful Shading Accent 6" w:semiHidden="0" w:uiPriority="71" w:unhideWhenUsed="0"/>
-    <w:lsdException w:name="Colorful List Accent 6" w:semiHidden="0" w:uiPriority="72" w:unhideWhenUsed="0"/>
-    <w:lsdException w:name="Colorful Grid Accent 6" w:semiHidden="0" w:uiPriority="73" w:unhideWhenUsed="0"/>
-    <w:lsdException w:name="Subtle Emphasis" w:semiHidden="0" w:uiPriority="19" w:unhideWhenUsed="0" w:qFormat="1"/>
-    <w:lsdException w:name="Intense Emphasis" w:semiHidden="0" w:uiPriority="21" w:unhideWhenUsed="0" w:qFormat="1"/>
-    <w:lsdException w:name="Subtle Reference" w:semiHidden="0" w:uiPriority="31" w:unhideWhenUsed="0" w:qFormat="1"/>
-    <w:lsdException w:name="Intense Reference" w:semiHidden="0" w:uiPriority="32" w:unhideWhenUsed="0" w:qFormat="1"/>
-    <w:lsdException w:name="Book Title" w:semiHidden="0" w:uiPriority="33" w:unhideWhenUsed="0" w:qFormat="1"/>
+    <w:lsdException w:name="List Paragraph" w:uiPriority="34" w:semiHidden="0" w:unhideWhenUsed="0" w:qFormat="1"/>
+    <w:lsdException w:name="Quote" w:uiPriority="29" w:semiHidden="0" w:unhideWhenUsed="0" w:qFormat="1"/>
+    <w:lsdException w:name="Intense Quote" w:uiPriority="30" w:semiHidden="0" w:unhideWhenUsed="0" w:qFormat="1"/>
+    <w:lsdException w:name="Medium List 2 Accent 1" w:uiPriority="66" w:semiHidden="0" w:unhideWhenUsed="0"/>
+    <w:lsdException w:name="Medium Grid 1 Accent 1" w:uiPriority="67" w:semiHidden="0" w:unhideWhenUsed="0"/>
+    <w:lsdException w:name="Medium Grid 2 Accent 1" w:uiPriority="68" w:semiHidden="0" w:unhideWhenUsed="0"/>
+    <w:lsdException w:name="Medium Grid 3 Accent 1" w:uiPriority="69" w:semiHidden="0" w:unhideWhenUsed="0"/>
+    <w:lsdException w:name="Dark List Accent 1" w:uiPriority="70" w:semiHidden="0" w:unhideWhenUsed="0"/>
+    <w:lsdException w:name="Colorful Shading Accent 1" w:uiPriority="71" w:semiHidden="0" w:unhideWhenUsed="0"/>
+    <w:lsdException w:name="Colorful List Accent 1" w:uiPriority="72" w:semiHidden="0" w:unhideWhenUsed="0"/>
+    <w:lsdException w:name="Colorful Grid Accent 1" w:uiPriority="73" w:semiHidden="0" w:unhideWhenUsed="0"/>
+    <w:lsdException w:name="Light Shading Accent 2" w:uiPriority="60" w:semiHidden="0" w:unhideWhenUsed="0"/>
+    <w:lsdException w:name="Light List Accent 2" w:uiPriority="61" w:semiHidden="0" w:unhideWhenUsed="0"/>
+    <w:lsdException w:name="Light Grid Accent 2" w:uiPriority="62" w:semiHidden="0" w:unhideWhenUsed="0"/>
+    <w:lsdException w:name="Medium Shading 1 Accent 2" w:uiPriority="63" w:semiHidden="0" w:unhideWhenUsed="0"/>
+    <w:lsdException w:name="Medium Shading 2 Accent 2" w:uiPriority="64" w:semiHidden="0" w:unhideWhenUsed="0"/>
+    <w:lsdException w:name="Medium List 1 Accent 2" w:uiPriority="65" w:semiHidden="0" w:unhideWhenUsed="0"/>
+    <w:lsdException w:name="Medium List 2 Accent 2" w:uiPriority="66" w:semiHidden="0" w:unhideWhenUsed="0"/>
+    <w:lsdException w:name="Medium Grid 1 Accent 2" w:uiPriority="67" w:semiHidden="0" w:unhideWhenUsed="0"/>
+    <w:lsdException w:name="Medium Grid 2 Accent 2" w:uiPriority="68" w:semiHidden="0" w:unhideWhenUsed="0"/>
+    <w:lsdException w:name="Medium Grid 3 Accent 2" w:uiPriority="69" w:semiHidden="0" w:unhideWhenUsed="0"/>
+    <w:lsdException w:name="Dark List Accent 2" w:uiPriority="70" w:semiHidden="0" w:unhideWhenUsed="0"/>
+    <w:lsdException w:name="Colorful Shading Accent 2" w:uiPriority="71" w:semiHidden="0" w:unhideWhenUsed="0"/>
+    <w:lsdException w:name="Colorful List Accent 2" w:uiPriority="72" w:semiHidden="0" w:unhideWhenUsed="0"/>
+    <w:lsdException w:name="Colorful Grid Accent 2" w:uiPriority="73" w:semiHidden="0" w:unhideWhenUsed="0"/>
+    <w:lsdException w:name="Light Shading Accent 3" w:uiPriority="60" w:semiHidden="0" w:unhideWhenUsed="0"/>
+    <w:lsdException w:name="Light List Accent 3" w:uiPriority="61" w:semiHidden="0" w:unhideWhenUsed="0"/>
+    <w:lsdException w:name="Light Grid Accent 3" w:uiPriority="62" w:semiHidden="0" w:unhideWhenUsed="0"/>
+    <w:lsdException w:name="Medium Shading 1 Accent 3" w:uiPriority="63" w:semiHidden="0" w:unhideWhenUsed="0"/>
+    <w:lsdException w:name="Medium Shading 2 Accent 3" w:uiPriority="64" w:semiHidden="0" w:unhideWhenUsed="0"/>
+    <w:lsdException w:name="Medium List 1 Accent 3" w:uiPriority="65" w:semiHidden="0" w:unhideWhenUsed="0"/>
+    <w:lsdException w:name="Medium List 2 Accent 3" w:uiPriority="66" w:semiHidden="0" w:unhideWhenUsed="0"/>
+    <w:lsdException w:name="Medium Grid 1 Accent 3" w:uiPriority="67" w:semiHidden="0" w:unhideWhenUsed="0"/>
+    <w:lsdException w:name="Medium Grid 2 Accent 3" w:uiPriority="68" w:semiHidden="0" w:unhideWhenUsed="0"/>
+    <w:lsdException w:name="Medium Grid 3 Accent 3" w:uiPriority="69" w:semiHidden="0" w:unhideWhenUsed="0"/>
+    <w:lsdException w:name="Dark List Accent 3" w:uiPriority="70" w:semiHidden="0" w:unhideWhenUsed="0"/>
+    <w:lsdException w:name="Colorful Shading Accent 3" w:uiPriority="71" w:semiHidden="0" w:unhideWhenUsed="0"/>
+    <w:lsdException w:name="Colorful List Accent 3" w:uiPriority="72" w:semiHidden="0" w:unhideWhenUsed="0"/>
+    <w:lsdException w:name="Colorful Grid Accent 3" w:uiPriority="73" w:semiHidden="0" w:unhideWhenUsed="0"/>
+    <w:lsdException w:name="Light Shading Accent 4" w:uiPriority="60" w:semiHidden="0" w:unhideWhenUsed="0"/>
+    <w:lsdException w:name="Light List Accent 4" w:uiPriority="61" w:semiHidden="0" w:unhideWhenUsed="0"/>
+    <w:lsdException w:name="Light Grid Accent 4" w:uiPriority="62" w:semiHidden="0" w:unhideWhenUsed="0"/>
+    <w:lsdException w:name="Medium Shading 1 Accent 4" w:uiPriority="63" w:semiHidden="0" w:unhideWhenUsed="0"/>
+    <w:lsdException w:name="Medium Shading 2 Accent 4" w:uiPriority="64" w:semiHidden="0" w:unhideWhenUsed="0"/>
+    <w:lsdException w:name="Medium List 1 Accent 4" w:uiPriority="65" w:semiHidden="0" w:unhideWhenUsed="0"/>
+    <w:lsdException w:name="Medium List 2 Accent 4" w:uiPriority="66" w:semiHidden="0" w:unhideWhenUsed="0"/>
+    <w:lsdException w:name="Medium Grid 1 Accent 4" w:uiPriority="67" w:semiHidden="0" w:unhideWhenUsed="0"/>
+    <w:lsdException w:name="Medium Grid 2 Accent 4" w:uiPriority="68" w:semiHidden="0" w:unhideWhenUsed="0"/>
+    <w:lsdException w:name="Medium Grid 3 Accent 4" w:uiPriority="69" w:semiHidden="0" w:unhideWhenUsed="0"/>
+    <w:lsdException w:name="Dark List Accent 4" w:uiPriority="70" w:semiHidden="0" w:unhideWhenUsed="0"/>
+    <w:lsdException w:name="Colorful Shading Accent 4" w:uiPriority="71" w:semiHidden="0" w:unhideWhenUsed="0"/>
+    <w:lsdException w:name="Colorful List Accent 4" w:uiPriority="72" w:semiHidden="0" w:unhideWhenUsed="0"/>
+    <w:lsdException w:name="Colorful Grid Accent 4" w:uiPriority="73" w:semiHidden="0" w:unhideWhenUsed="0"/>
+    <w:lsdException w:name="Light Shading Accent 5" w:uiPriority="60" w:semiHidden="0" w:unhideWhenUsed="0"/>
+    <w:lsdException w:name="Light List Accent 5" w:uiPriority="61" w:semiHidden="0" w:unhideWhenUsed="0"/>
+    <w:lsdException w:name="Light Grid Accent 5" w:uiPriority="62" w:semiHidden="0" w:unhideWhenUsed="0"/>
+    <w:lsdException w:name="Medium Shading 1 Accent 5" w:uiPriority="63" w:semiHidden="0" w:unhideWhenUsed="0"/>
+    <w:lsdException w:name="Medium Shading 2 Accent 5" w:uiPriority="64" w:semiHidden="0" w:unhideWhenUsed="0"/>
+    <w:lsdException w:name="Medium List 1 Accent 5" w:uiPriority="65" w:semiHidden="0" w:unhideWhenUsed="0"/>
+    <w:lsdException w:name="Medium List 2 Accent 5" w:uiPriority="66" w:semiHidden="0" w:unhideWhenUsed="0"/>
+    <w:lsdException w:name="Medium Grid 1 Accent 5" w:uiPriority="67" w:semiHidden="0" w:unhideWhenUsed="0"/>
+    <w:lsdException w:name="Medium Grid 2 Accent 5" w:uiPriority="68" w:semiHidden="0" w:unhideWhenUsed="0"/>
+    <w:lsdException w:name="Medium Grid 3 Accent 5" w:uiPriority="69" w:semiHidden="0" w:unhideWhenUsed="0"/>
+    <w:lsdException w:name="Dark List Accent 5" w:uiPriority="70" w:semiHidden="0" w:unhideWhenUsed="0"/>
+    <w:lsdException w:name="Colorful Shading Accent 5" w:uiPriority="71" w:semiHidden="0" w:unhideWhenUsed="0"/>
+    <w:lsdException w:name="Colorful List Accent 5" w:uiPriority="72" w:semiHidden="0" w:unhideWhenUsed="0"/>
+    <w:lsdException w:name="Colorful Grid Accent 5" w:uiPriority="73" w:semiHidden="0" w:unhideWhenUsed="0"/>
+    <w:lsdException w:name="Light Shading Accent 6" w:uiPriority="60" w:semiHidden="0" w:unhideWhenUsed="0"/>
+    <w:lsdException w:name="Light List Accent 6" w:uiPriority="61" w:semiHidden="0" w:unhideWhenUsed="0"/>
+    <w:lsdException w:name="Light Grid Accent 6" w:uiPriority="62" w:semiHidden="0" w:unhideWhenUsed="0"/>
+    <w:lsdException w:name="Medium Shading 1 Accent 6" w:uiPriority="63" w:semiHidden="0" w:unhideWhenUsed="0"/>
+    <w:lsdException w:name="Medium Shading 2 Accent 6" w:uiPriority="64" w:semiHidden="0" w:unhideWhenUsed="0"/>
+    <w:lsdException w:name="Medium List 1 Accent 6" w:uiPriority="65" w:semiHidden="0" w:unhideWhenUsed="0"/>
+    <w:lsdException w:name="Medium List 2 Accent 6" w:uiPriority="66" w:semiHidden="0" w:unhideWhenUsed="0"/>
+    <w:lsdException w:name="Medium Grid 1 Accent 6" w:uiPriority="67" w:semiHidden="0" w:unhideWhenUsed="0"/>
+    <w:lsdException w:name="Medium Grid 2 Accent 6" w:uiPriority="68" w:semiHidden="0" w:unhideWhenUsed="0"/>
+    <w:lsdException w:name="Medium Grid 3 Accent 6" w:uiPriority="69" w:semiHidden="0" w:unhideWhenUsed="0"/>
+    <w:lsdException w:name="Dark List Accent 6" w:uiPriority="70" w:semiHidden="0" w:unhideWhenUsed="0"/>
+    <w:lsdException w:name="Colorful Shading Accent 6" w:uiPriority="71" w:semiHidden="0" w:unhideWhenUsed="0"/>
+    <w:lsdException w:name="Colorful List Accent 6" w:uiPriority="72" w:semiHidden="0" w:unhideWhenUsed="0"/>
+    <w:lsdException w:name="Colorful Grid Accent 6" w:uiPriority="73" w:semiHidden="0" w:unhideWhenUsed="0"/>
+    <w:lsdException w:name="Subtle Emphasis" w:uiPriority="19" w:semiHidden="0" w:unhideWhenUsed="0" w:qFormat="1"/>
+    <w:lsdException w:name="Intense Emphasis" w:uiPriority="21" w:semiHidden="0" w:unhideWhenUsed="0" w:qFormat="1"/>
+    <w:lsdException w:name="Subtle Reference" w:uiPriority="31" w:semiHidden="0" w:unhideWhenUsed="0" w:qFormat="1"/>
+    <w:lsdException w:name="Intense Reference" w:uiPriority="32" w:semiHidden="0" w:unhideWhenUsed="0" w:qFormat="1"/>
+    <w:lsdException w:name="Book Title" w:uiPriority="33" w:semiHidden="0" w:unhideWhenUsed="0" w:qFormat="1"/>
     <w:lsdException w:name="Bibliography" w:uiPriority="37"/>
     <w:lsdException w:name="TOC Heading" w:uiPriority="39" w:qFormat="1"/>
   </w:latentStyles>
-  <w:style w:type="paragraph" w:default="1" w:styleId="a">
+  <w:style xmlns:mc="http://schemas.openxmlformats.org/markup-compatibility/2006" xmlns:r="http://schemas.openxmlformats.org/officeDocument/2006/relationships" xmlns:w="http://schemas.openxmlformats.org/wordprocessingml/2006/main" xmlns:w14="http://schemas.microsoft.com/office/word/2010/wordml" w:type="paragraph" w:styleId="a" w:default="1">
     <w:name w:val="Normal"/>
     <w:qFormat/>
   </w:style>
-  <w:style w:type="table" w:default="1" w:styleId="a1">
+  <w:style xmlns:mc="http://schemas.openxmlformats.org/markup-compatibility/2006" xmlns:r="http://schemas.openxmlformats.org/officeDocument/2006/relationships" xmlns:w="http://schemas.openxmlformats.org/wordprocessingml/2006/main" xmlns:w14="http://schemas.microsoft.com/office/word/2010/wordml" w:type="table" w:styleId="a1" w:default="1">
     <w:name w:val="Normal Table"/>
     <w:uiPriority w:val="99"/>
     <w:semiHidden/>
@@ -193,13 +193,13 @@
       </w:tblCellMar>
     </w:tblPr>
   </w:style>
-  <w:style w:type="numbering" w:default="1" w:styleId="a2">
+  <w:style xmlns:mc="http://schemas.openxmlformats.org/markup-compatibility/2006" xmlns:r="http://schemas.openxmlformats.org/officeDocument/2006/relationships" xmlns:w="http://schemas.openxmlformats.org/wordprocessingml/2006/main" xmlns:w14="http://schemas.microsoft.com/office/word/2010/wordml" w:type="numbering" w:styleId="a2" w:default="1">
     <w:name w:val="No List"/>
     <w:uiPriority w:val="99"/>
     <w:semiHidden/>
     <w:unhideWhenUsed/>
   </w:style>
-  <w:style w:type="paragraph" w:styleId="a7">
+  <w:style xmlns:mc="http://schemas.openxmlformats.org/markup-compatibility/2006" xmlns:r="http://schemas.openxmlformats.org/officeDocument/2006/relationships" xmlns:w="http://schemas.openxmlformats.org/wordprocessingml/2006/main" xmlns:w14="http://schemas.microsoft.com/office/word/2010/wordml" w:type="paragraph" w:styleId="a7">
     <w:name w:val="No Spacing"/>
     <w:basedOn w:val="a"/>
     <w:uiPriority w:val="1"/>
@@ -208,7 +208,7 @@
       <w:spacing w:after="0" w:line="240" w:lineRule="auto"/>
     </w:pPr>
   </w:style>
-  <w:style w:type="paragraph" w:styleId="af5">
+  <w:style xmlns:mc="http://schemas.openxmlformats.org/markup-compatibility/2006" xmlns:r="http://schemas.openxmlformats.org/officeDocument/2006/relationships" xmlns:w="http://schemas.openxmlformats.org/wordprocessingml/2006/main" xmlns:w14="http://schemas.microsoft.com/office/word/2010/wordml" w:type="paragraph" w:styleId="af5">
     <w:name w:val="List Paragraph"/>
     <w:basedOn w:val="a"/>
     <w:uiPriority w:val="34"/>

</xml_diff>

<commit_message>
feat(server): support MCP UTF-8 text and structured Office editing (#86)
* feat(server): support MCP UTF-8 text and structured Office editing

* fix(ci): copy officecli to system path and surface processing errors

* fix(mcp): refine text binary signatures and bind officecli flags
</commit_message>
<xml_diff>
--- a/apps/server/internal/office/templates/en-US/new.docx
+++ b/apps/server/internal/office/templates/en-US/new.docx
@@ -19,13 +19,13 @@
 
 <file path=word/styles.xml><?xml version="1.0" encoding="utf-8"?>
 <w:styles xmlns:mc="http://schemas.openxmlformats.org/markup-compatibility/2006" xmlns:r="http://schemas.openxmlformats.org/officeDocument/2006/relationships" xmlns:w="http://schemas.openxmlformats.org/wordprocessingml/2006/main" xmlns:w14="http://schemas.microsoft.com/office/word/2010/wordml" mc:Ignorable="w14">
-  <w:docDefaults>
+  <w:docDefaults xmlns:mc="http://schemas.openxmlformats.org/markup-compatibility/2006" xmlns:r="http://schemas.openxmlformats.org/officeDocument/2006/relationships" xmlns:w="http://schemas.openxmlformats.org/wordprocessingml/2006/main" xmlns:w14="http://schemas.microsoft.com/office/word/2010/wordml">
     <w:rPrDefault>
       <w:rPr>
-        <w:rFonts w:asciiTheme="minorHAnsi" w:eastAsiaTheme="minorHAnsi" w:hAnsiTheme="minorHAnsi" w:cstheme="minorBidi"/>
+        <w:rFonts w:asciiTheme="minorHAnsi" w:hAnsiTheme="minorHAnsi" w:eastAsiaTheme="minorHAnsi" w:cstheme="minorBidi"/>
         <w:sz w:val="22"/>
-        <w:lang w:val="en-US" w:bidi="ar-SA" w:eastAsia="en-US"/>
-        <w:szCs w:val="22"/>
+        <w:szCs xmlns:w="http://schemas.openxmlformats.org/wordprocessingml/2006/main" w:val="22"/>
+        <w:lang w:val="en-US" w:eastAsia="en-US" w:bidi="ar-SA"/>
       </w:rPr>
     </w:rPrDefault>
     <w:pPrDefault>
@@ -34,9 +34,9 @@
       </w:pPr>
     </w:pPrDefault>
   </w:docDefaults>
-  <w:latentStyles w:defLockedState="0" w:defUIPriority="99" w:defSemiHidden="1" w:defUnhideWhenUsed="1" w:defQFormat="0" w:count="267">
-    <w:lsdException w:name="Normal" w:semiHidden="0" w:uiPriority="0" w:unhideWhenUsed="0" w:qFormat="1"/>
-    <w:lsdException w:name="heading 1" w:semiHidden="0" w:uiPriority="9" w:unhideWhenUsed="0" w:qFormat="1"/>
+  <w:latentStyles xmlns:mc="http://schemas.openxmlformats.org/markup-compatibility/2006" xmlns:r="http://schemas.openxmlformats.org/officeDocument/2006/relationships" xmlns:w="http://schemas.openxmlformats.org/wordprocessingml/2006/main" xmlns:w14="http://schemas.microsoft.com/office/word/2010/wordml" w:defLockedState="0" w:defUIPriority="99" w:defSemiHidden="1" w:defUnhideWhenUsed="1" w:defQFormat="0" w:count="267">
+    <w:lsdException w:name="Normal" w:uiPriority="0" w:semiHidden="0" w:unhideWhenUsed="0" w:qFormat="1"/>
+    <w:lsdException w:name="heading 1" w:uiPriority="9" w:semiHidden="0" w:unhideWhenUsed="0" w:qFormat="1"/>
     <w:lsdException w:name="heading 2" w:uiPriority="9" w:qFormat="1"/>
     <w:lsdException w:name="heading 3" w:uiPriority="9" w:qFormat="1"/>
     <w:lsdException w:name="heading 4" w:uiPriority="9" w:qFormat="1"/>
@@ -56,129 +56,129 @@
     <w:lsdException w:name="toc 9" w:uiPriority="39"/>
     <w:lsdException w:name="footer" w:uiPriority="0" w:qFormat="1"/>
     <w:lsdException w:name="caption" w:uiPriority="35" w:qFormat="1"/>
-    <w:lsdException w:name="Title" w:semiHidden="0" w:uiPriority="10" w:unhideWhenUsed="0" w:qFormat="1"/>
+    <w:lsdException w:name="Title" w:uiPriority="10" w:semiHidden="0" w:unhideWhenUsed="0" w:qFormat="1"/>
     <w:lsdException w:name="Default Paragraph Font" w:uiPriority="1"/>
-    <w:lsdException w:name="Subtitle" w:semiHidden="0" w:uiPriority="11" w:unhideWhenUsed="0" w:qFormat="1"/>
-    <w:lsdException w:name="Strong" w:semiHidden="0" w:uiPriority="22" w:unhideWhenUsed="0" w:qFormat="1"/>
-    <w:lsdException w:name="Emphasis" w:semiHidden="0" w:uiPriority="20" w:unhideWhenUsed="0" w:qFormat="1"/>
-    <w:lsdException w:name="Table Grid" w:semiHidden="0" w:uiPriority="59" w:unhideWhenUsed="0"/>
+    <w:lsdException w:name="Subtitle" w:uiPriority="11" w:semiHidden="0" w:unhideWhenUsed="0" w:qFormat="1"/>
+    <w:lsdException w:name="Strong" w:uiPriority="22" w:semiHidden="0" w:unhideWhenUsed="0" w:qFormat="1"/>
+    <w:lsdException w:name="Emphasis" w:uiPriority="20" w:semiHidden="0" w:unhideWhenUsed="0" w:qFormat="1"/>
+    <w:lsdException w:name="Table Grid" w:uiPriority="59" w:semiHidden="0" w:unhideWhenUsed="0"/>
     <w:lsdException w:name="Placeholder Text" w:unhideWhenUsed="0"/>
-    <w:lsdException w:name="No Spacing" w:semiHidden="0" w:uiPriority="1" w:unhideWhenUsed="0" w:qFormat="1"/>
-    <w:lsdException w:name="Light Shading" w:semiHidden="0" w:uiPriority="60" w:unhideWhenUsed="0"/>
-    <w:lsdException w:name="Light List" w:semiHidden="0" w:uiPriority="61" w:unhideWhenUsed="0"/>
-    <w:lsdException w:name="Light Grid" w:semiHidden="0" w:uiPriority="62" w:unhideWhenUsed="0"/>
-    <w:lsdException w:name="Medium Shading 1" w:semiHidden="0" w:uiPriority="63" w:unhideWhenUsed="0"/>
-    <w:lsdException w:name="Medium Shading 2" w:semiHidden="0" w:uiPriority="64" w:unhideWhenUsed="0"/>
-    <w:lsdException w:name="Medium List 1" w:semiHidden="0" w:uiPriority="65" w:unhideWhenUsed="0"/>
-    <w:lsdException w:name="Medium List 2" w:semiHidden="0" w:uiPriority="66" w:unhideWhenUsed="0"/>
-    <w:lsdException w:name="Medium Grid 1" w:semiHidden="0" w:uiPriority="67" w:unhideWhenUsed="0"/>
-    <w:lsdException w:name="Medium Grid 2" w:semiHidden="0" w:uiPriority="68" w:unhideWhenUsed="0"/>
-    <w:lsdException w:name="Medium Grid 3" w:semiHidden="0" w:uiPriority="69" w:unhideWhenUsed="0"/>
-    <w:lsdException w:name="Dark List" w:semiHidden="0" w:uiPriority="70" w:unhideWhenUsed="0"/>
-    <w:lsdException w:name="Colorful Shading" w:semiHidden="0" w:uiPriority="71" w:unhideWhenUsed="0"/>
-    <w:lsdException w:name="Colorful List" w:semiHidden="0" w:uiPriority="72" w:unhideWhenUsed="0"/>
-    <w:lsdException w:name="Colorful Grid" w:semiHidden="0" w:uiPriority="73" w:unhideWhenUsed="0"/>
-    <w:lsdException w:name="Light Shading Accent 1" w:semiHidden="0" w:uiPriority="60" w:unhideWhenUsed="0"/>
-    <w:lsdException w:name="Light List Accent 1" w:semiHidden="0" w:uiPriority="61" w:unhideWhenUsed="0"/>
-    <w:lsdException w:name="Light Grid Accent 1" w:semiHidden="0" w:uiPriority="62" w:unhideWhenUsed="0"/>
-    <w:lsdException w:name="Medium Shading 1 Accent 1" w:semiHidden="0" w:uiPriority="63" w:unhideWhenUsed="0"/>
-    <w:lsdException w:name="Medium Shading 2 Accent 1" w:semiHidden="0" w:uiPriority="64" w:unhideWhenUsed="0"/>
-    <w:lsdException w:name="Medium List 1 Accent 1" w:semiHidden="0" w:uiPriority="65" w:unhideWhenUsed="0"/>
+    <w:lsdException w:name="No Spacing" w:uiPriority="1" w:semiHidden="0" w:unhideWhenUsed="0" w:qFormat="1"/>
+    <w:lsdException w:name="Light Shading" w:uiPriority="60" w:semiHidden="0" w:unhideWhenUsed="0"/>
+    <w:lsdException w:name="Light List" w:uiPriority="61" w:semiHidden="0" w:unhideWhenUsed="0"/>
+    <w:lsdException w:name="Light Grid" w:uiPriority="62" w:semiHidden="0" w:unhideWhenUsed="0"/>
+    <w:lsdException w:name="Medium Shading 1" w:uiPriority="63" w:semiHidden="0" w:unhideWhenUsed="0"/>
+    <w:lsdException w:name="Medium Shading 2" w:uiPriority="64" w:semiHidden="0" w:unhideWhenUsed="0"/>
+    <w:lsdException w:name="Medium List 1" w:uiPriority="65" w:semiHidden="0" w:unhideWhenUsed="0"/>
+    <w:lsdException w:name="Medium List 2" w:uiPriority="66" w:semiHidden="0" w:unhideWhenUsed="0"/>
+    <w:lsdException w:name="Medium Grid 1" w:uiPriority="67" w:semiHidden="0" w:unhideWhenUsed="0"/>
+    <w:lsdException w:name="Medium Grid 2" w:uiPriority="68" w:semiHidden="0" w:unhideWhenUsed="0"/>
+    <w:lsdException w:name="Medium Grid 3" w:uiPriority="69" w:semiHidden="0" w:unhideWhenUsed="0"/>
+    <w:lsdException w:name="Dark List" w:uiPriority="70" w:semiHidden="0" w:unhideWhenUsed="0"/>
+    <w:lsdException w:name="Colorful Shading" w:uiPriority="71" w:semiHidden="0" w:unhideWhenUsed="0"/>
+    <w:lsdException w:name="Colorful List" w:uiPriority="72" w:semiHidden="0" w:unhideWhenUsed="0"/>
+    <w:lsdException w:name="Colorful Grid" w:uiPriority="73" w:semiHidden="0" w:unhideWhenUsed="0"/>
+    <w:lsdException w:name="Light Shading Accent 1" w:uiPriority="60" w:semiHidden="0" w:unhideWhenUsed="0"/>
+    <w:lsdException w:name="Light List Accent 1" w:uiPriority="61" w:semiHidden="0" w:unhideWhenUsed="0"/>
+    <w:lsdException w:name="Light Grid Accent 1" w:uiPriority="62" w:semiHidden="0" w:unhideWhenUsed="0"/>
+    <w:lsdException w:name="Medium Shading 1 Accent 1" w:uiPriority="63" w:semiHidden="0" w:unhideWhenUsed="0"/>
+    <w:lsdException w:name="Medium Shading 2 Accent 1" w:uiPriority="64" w:semiHidden="0" w:unhideWhenUsed="0"/>
+    <w:lsdException w:name="Medium List 1 Accent 1" w:uiPriority="65" w:semiHidden="0" w:unhideWhenUsed="0"/>
     <w:lsdException w:name="Revision" w:unhideWhenUsed="0"/>
-    <w:lsdException w:name="List Paragraph" w:semiHidden="0" w:uiPriority="34" w:unhideWhenUsed="0" w:qFormat="1"/>
-    <w:lsdException w:name="Quote" w:semiHidden="0" w:uiPriority="29" w:unhideWhenUsed="0" w:qFormat="1"/>
-    <w:lsdException w:name="Intense Quote" w:semiHidden="0" w:uiPriority="30" w:unhideWhenUsed="0" w:qFormat="1"/>
-    <w:lsdException w:name="Medium List 2 Accent 1" w:semiHidden="0" w:uiPriority="66" w:unhideWhenUsed="0"/>
-    <w:lsdException w:name="Medium Grid 1 Accent 1" w:semiHidden="0" w:uiPriority="67" w:unhideWhenUsed="0"/>
-    <w:lsdException w:name="Medium Grid 2 Accent 1" w:semiHidden="0" w:uiPriority="68" w:unhideWhenUsed="0"/>
-    <w:lsdException w:name="Medium Grid 3 Accent 1" w:semiHidden="0" w:uiPriority="69" w:unhideWhenUsed="0"/>
-    <w:lsdException w:name="Dark List Accent 1" w:semiHidden="0" w:uiPriority="70" w:unhideWhenUsed="0"/>
-    <w:lsdException w:name="Colorful Shading Accent 1" w:semiHidden="0" w:uiPriority="71" w:unhideWhenUsed="0"/>
-    <w:lsdException w:name="Colorful List Accent 1" w:semiHidden="0" w:uiPriority="72" w:unhideWhenUsed="0"/>
-    <w:lsdException w:name="Colorful Grid Accent 1" w:semiHidden="0" w:uiPriority="73" w:unhideWhenUsed="0"/>
-    <w:lsdException w:name="Light Shading Accent 2" w:semiHidden="0" w:uiPriority="60" w:unhideWhenUsed="0"/>
-    <w:lsdException w:name="Light List Accent 2" w:semiHidden="0" w:uiPriority="61" w:unhideWhenUsed="0"/>
-    <w:lsdException w:name="Light Grid Accent 2" w:semiHidden="0" w:uiPriority="62" w:unhideWhenUsed="0"/>
-    <w:lsdException w:name="Medium Shading 1 Accent 2" w:semiHidden="0" w:uiPriority="63" w:unhideWhenUsed="0"/>
-    <w:lsdException w:name="Medium Shading 2 Accent 2" w:semiHidden="0" w:uiPriority="64" w:unhideWhenUsed="0"/>
-    <w:lsdException w:name="Medium List 1 Accent 2" w:semiHidden="0" w:uiPriority="65" w:unhideWhenUsed="0"/>
-    <w:lsdException w:name="Medium List 2 Accent 2" w:semiHidden="0" w:uiPriority="66" w:unhideWhenUsed="0"/>
-    <w:lsdException w:name="Medium Grid 1 Accent 2" w:semiHidden="0" w:uiPriority="67" w:unhideWhenUsed="0"/>
-    <w:lsdException w:name="Medium Grid 2 Accent 2" w:semiHidden="0" w:uiPriority="68" w:unhideWhenUsed="0"/>
-    <w:lsdException w:name="Medium Grid 3 Accent 2" w:semiHidden="0" w:uiPriority="69" w:unhideWhenUsed="0"/>
-    <w:lsdException w:name="Dark List Accent 2" w:semiHidden="0" w:uiPriority="70" w:unhideWhenUsed="0"/>
-    <w:lsdException w:name="Colorful Shading Accent 2" w:semiHidden="0" w:uiPriority="71" w:unhideWhenUsed="0"/>
-    <w:lsdException w:name="Colorful List Accent 2" w:semiHidden="0" w:uiPriority="72" w:unhideWhenUsed="0"/>
-    <w:lsdException w:name="Colorful Grid Accent 2" w:semiHidden="0" w:uiPriority="73" w:unhideWhenUsed="0"/>
-    <w:lsdException w:name="Light Shading Accent 3" w:semiHidden="0" w:uiPriority="60" w:unhideWhenUsed="0"/>
-    <w:lsdException w:name="Light List Accent 3" w:semiHidden="0" w:uiPriority="61" w:unhideWhenUsed="0"/>
-    <w:lsdException w:name="Light Grid Accent 3" w:semiHidden="0" w:uiPriority="62" w:unhideWhenUsed="0"/>
-    <w:lsdException w:name="Medium Shading 1 Accent 3" w:semiHidden="0" w:uiPriority="63" w:unhideWhenUsed="0"/>
-    <w:lsdException w:name="Medium Shading 2 Accent 3" w:semiHidden="0" w:uiPriority="64" w:unhideWhenUsed="0"/>
-    <w:lsdException w:name="Medium List 1 Accent 3" w:semiHidden="0" w:uiPriority="65" w:unhideWhenUsed="0"/>
-    <w:lsdException w:name="Medium List 2 Accent 3" w:semiHidden="0" w:uiPriority="66" w:unhideWhenUsed="0"/>
-    <w:lsdException w:name="Medium Grid 1 Accent 3" w:semiHidden="0" w:uiPriority="67" w:unhideWhenUsed="0"/>
-    <w:lsdException w:name="Medium Grid 2 Accent 3" w:semiHidden="0" w:uiPriority="68" w:unhideWhenUsed="0"/>
-    <w:lsdException w:name="Medium Grid 3 Accent 3" w:semiHidden="0" w:uiPriority="69" w:unhideWhenUsed="0"/>
-    <w:lsdException w:name="Dark List Accent 3" w:semiHidden="0" w:uiPriority="70" w:unhideWhenUsed="0"/>
-    <w:lsdException w:name="Colorful Shading Accent 3" w:semiHidden="0" w:uiPriority="71" w:unhideWhenUsed="0"/>
-    <w:lsdException w:name="Colorful List Accent 3" w:semiHidden="0" w:uiPriority="72" w:unhideWhenUsed="0"/>
-    <w:lsdException w:name="Colorful Grid Accent 3" w:semiHidden="0" w:uiPriority="73" w:unhideWhenUsed="0"/>
-    <w:lsdException w:name="Light Shading Accent 4" w:semiHidden="0" w:uiPriority="60" w:unhideWhenUsed="0"/>
-    <w:lsdException w:name="Light List Accent 4" w:semiHidden="0" w:uiPriority="61" w:unhideWhenUsed="0"/>
-    <w:lsdException w:name="Light Grid Accent 4" w:semiHidden="0" w:uiPriority="62" w:unhideWhenUsed="0"/>
-    <w:lsdException w:name="Medium Shading 1 Accent 4" w:semiHidden="0" w:uiPriority="63" w:unhideWhenUsed="0"/>
-    <w:lsdException w:name="Medium Shading 2 Accent 4" w:semiHidden="0" w:uiPriority="64" w:unhideWhenUsed="0"/>
-    <w:lsdException w:name="Medium List 1 Accent 4" w:semiHidden="0" w:uiPriority="65" w:unhideWhenUsed="0"/>
-    <w:lsdException w:name="Medium List 2 Accent 4" w:semiHidden="0" w:uiPriority="66" w:unhideWhenUsed="0"/>
-    <w:lsdException w:name="Medium Grid 1 Accent 4" w:semiHidden="0" w:uiPriority="67" w:unhideWhenUsed="0"/>
-    <w:lsdException w:name="Medium Grid 2 Accent 4" w:semiHidden="0" w:uiPriority="68" w:unhideWhenUsed="0"/>
-    <w:lsdException w:name="Medium Grid 3 Accent 4" w:semiHidden="0" w:uiPriority="69" w:unhideWhenUsed="0"/>
-    <w:lsdException w:name="Dark List Accent 4" w:semiHidden="0" w:uiPriority="70" w:unhideWhenUsed="0"/>
-    <w:lsdException w:name="Colorful Shading Accent 4" w:semiHidden="0" w:uiPriority="71" w:unhideWhenUsed="0"/>
-    <w:lsdException w:name="Colorful List Accent 4" w:semiHidden="0" w:uiPriority="72" w:unhideWhenUsed="0"/>
-    <w:lsdException w:name="Colorful Grid Accent 4" w:semiHidden="0" w:uiPriority="73" w:unhideWhenUsed="0"/>
-    <w:lsdException w:name="Light Shading Accent 5" w:semiHidden="0" w:uiPriority="60" w:unhideWhenUsed="0"/>
-    <w:lsdException w:name="Light List Accent 5" w:semiHidden="0" w:uiPriority="61" w:unhideWhenUsed="0"/>
-    <w:lsdException w:name="Light Grid Accent 5" w:semiHidden="0" w:uiPriority="62" w:unhideWhenUsed="0"/>
-    <w:lsdException w:name="Medium Shading 1 Accent 5" w:semiHidden="0" w:uiPriority="63" w:unhideWhenUsed="0"/>
-    <w:lsdException w:name="Medium Shading 2 Accent 5" w:semiHidden="0" w:uiPriority="64" w:unhideWhenUsed="0"/>
-    <w:lsdException w:name="Medium List 1 Accent 5" w:semiHidden="0" w:uiPriority="65" w:unhideWhenUsed="0"/>
-    <w:lsdException w:name="Medium List 2 Accent 5" w:semiHidden="0" w:uiPriority="66" w:unhideWhenUsed="0"/>
-    <w:lsdException w:name="Medium Grid 1 Accent 5" w:semiHidden="0" w:uiPriority="67" w:unhideWhenUsed="0"/>
-    <w:lsdException w:name="Medium Grid 2 Accent 5" w:semiHidden="0" w:uiPriority="68" w:unhideWhenUsed="0"/>
-    <w:lsdException w:name="Medium Grid 3 Accent 5" w:semiHidden="0" w:uiPriority="69" w:unhideWhenUsed="0"/>
-    <w:lsdException w:name="Dark List Accent 5" w:semiHidden="0" w:uiPriority="70" w:unhideWhenUsed="0"/>
-    <w:lsdException w:name="Colorful Shading Accent 5" w:semiHidden="0" w:uiPriority="71" w:unhideWhenUsed="0"/>
-    <w:lsdException w:name="Colorful List Accent 5" w:semiHidden="0" w:uiPriority="72" w:unhideWhenUsed="0"/>
-    <w:lsdException w:name="Colorful Grid Accent 5" w:semiHidden="0" w:uiPriority="73" w:unhideWhenUsed="0"/>
-    <w:lsdException w:name="Light Shading Accent 6" w:semiHidden="0" w:uiPriority="60" w:unhideWhenUsed="0"/>
-    <w:lsdException w:name="Light List Accent 6" w:semiHidden="0" w:uiPriority="61" w:unhideWhenUsed="0"/>
-    <w:lsdException w:name="Light Grid Accent 6" w:semiHidden="0" w:uiPriority="62" w:unhideWhenUsed="0"/>
-    <w:lsdException w:name="Medium Shading 1 Accent 6" w:semiHidden="0" w:uiPriority="63" w:unhideWhenUsed="0"/>
-    <w:lsdException w:name="Medium Shading 2 Accent 6" w:semiHidden="0" w:uiPriority="64" w:unhideWhenUsed="0"/>
-    <w:lsdException w:name="Medium List 1 Accent 6" w:semiHidden="0" w:uiPriority="65" w:unhideWhenUsed="0"/>
-    <w:lsdException w:name="Medium List 2 Accent 6" w:semiHidden="0" w:uiPriority="66" w:unhideWhenUsed="0"/>
-    <w:lsdException w:name="Medium Grid 1 Accent 6" w:semiHidden="0" w:uiPriority="67" w:unhideWhenUsed="0"/>
-    <w:lsdException w:name="Medium Grid 2 Accent 6" w:semiHidden="0" w:uiPriority="68" w:unhideWhenUsed="0"/>
-    <w:lsdException w:name="Medium Grid 3 Accent 6" w:semiHidden="0" w:uiPriority="69" w:unhideWhenUsed="0"/>
-    <w:lsdException w:name="Dark List Accent 6" w:semiHidden="0" w:uiPriority="70" w:unhideWhenUsed="0"/>
-    <w:lsdException w:name="Colorful Shading Accent 6" w:semiHidden="0" w:uiPriority="71" w:unhideWhenUsed="0"/>
-    <w:lsdException w:name="Colorful List Accent 6" w:semiHidden="0" w:uiPriority="72" w:unhideWhenUsed="0"/>
-    <w:lsdException w:name="Colorful Grid Accent 6" w:semiHidden="0" w:uiPriority="73" w:unhideWhenUsed="0"/>
-    <w:lsdException w:name="Subtle Emphasis" w:semiHidden="0" w:uiPriority="19" w:unhideWhenUsed="0" w:qFormat="1"/>
-    <w:lsdException w:name="Intense Emphasis" w:semiHidden="0" w:uiPriority="21" w:unhideWhenUsed="0" w:qFormat="1"/>
-    <w:lsdException w:name="Subtle Reference" w:semiHidden="0" w:uiPriority="31" w:unhideWhenUsed="0" w:qFormat="1"/>
-    <w:lsdException w:name="Intense Reference" w:semiHidden="0" w:uiPriority="32" w:unhideWhenUsed="0" w:qFormat="1"/>
-    <w:lsdException w:name="Book Title" w:semiHidden="0" w:uiPriority="33" w:unhideWhenUsed="0" w:qFormat="1"/>
+    <w:lsdException w:name="List Paragraph" w:uiPriority="34" w:semiHidden="0" w:unhideWhenUsed="0" w:qFormat="1"/>
+    <w:lsdException w:name="Quote" w:uiPriority="29" w:semiHidden="0" w:unhideWhenUsed="0" w:qFormat="1"/>
+    <w:lsdException w:name="Intense Quote" w:uiPriority="30" w:semiHidden="0" w:unhideWhenUsed="0" w:qFormat="1"/>
+    <w:lsdException w:name="Medium List 2 Accent 1" w:uiPriority="66" w:semiHidden="0" w:unhideWhenUsed="0"/>
+    <w:lsdException w:name="Medium Grid 1 Accent 1" w:uiPriority="67" w:semiHidden="0" w:unhideWhenUsed="0"/>
+    <w:lsdException w:name="Medium Grid 2 Accent 1" w:uiPriority="68" w:semiHidden="0" w:unhideWhenUsed="0"/>
+    <w:lsdException w:name="Medium Grid 3 Accent 1" w:uiPriority="69" w:semiHidden="0" w:unhideWhenUsed="0"/>
+    <w:lsdException w:name="Dark List Accent 1" w:uiPriority="70" w:semiHidden="0" w:unhideWhenUsed="0"/>
+    <w:lsdException w:name="Colorful Shading Accent 1" w:uiPriority="71" w:semiHidden="0" w:unhideWhenUsed="0"/>
+    <w:lsdException w:name="Colorful List Accent 1" w:uiPriority="72" w:semiHidden="0" w:unhideWhenUsed="0"/>
+    <w:lsdException w:name="Colorful Grid Accent 1" w:uiPriority="73" w:semiHidden="0" w:unhideWhenUsed="0"/>
+    <w:lsdException w:name="Light Shading Accent 2" w:uiPriority="60" w:semiHidden="0" w:unhideWhenUsed="0"/>
+    <w:lsdException w:name="Light List Accent 2" w:uiPriority="61" w:semiHidden="0" w:unhideWhenUsed="0"/>
+    <w:lsdException w:name="Light Grid Accent 2" w:uiPriority="62" w:semiHidden="0" w:unhideWhenUsed="0"/>
+    <w:lsdException w:name="Medium Shading 1 Accent 2" w:uiPriority="63" w:semiHidden="0" w:unhideWhenUsed="0"/>
+    <w:lsdException w:name="Medium Shading 2 Accent 2" w:uiPriority="64" w:semiHidden="0" w:unhideWhenUsed="0"/>
+    <w:lsdException w:name="Medium List 1 Accent 2" w:uiPriority="65" w:semiHidden="0" w:unhideWhenUsed="0"/>
+    <w:lsdException w:name="Medium List 2 Accent 2" w:uiPriority="66" w:semiHidden="0" w:unhideWhenUsed="0"/>
+    <w:lsdException w:name="Medium Grid 1 Accent 2" w:uiPriority="67" w:semiHidden="0" w:unhideWhenUsed="0"/>
+    <w:lsdException w:name="Medium Grid 2 Accent 2" w:uiPriority="68" w:semiHidden="0" w:unhideWhenUsed="0"/>
+    <w:lsdException w:name="Medium Grid 3 Accent 2" w:uiPriority="69" w:semiHidden="0" w:unhideWhenUsed="0"/>
+    <w:lsdException w:name="Dark List Accent 2" w:uiPriority="70" w:semiHidden="0" w:unhideWhenUsed="0"/>
+    <w:lsdException w:name="Colorful Shading Accent 2" w:uiPriority="71" w:semiHidden="0" w:unhideWhenUsed="0"/>
+    <w:lsdException w:name="Colorful List Accent 2" w:uiPriority="72" w:semiHidden="0" w:unhideWhenUsed="0"/>
+    <w:lsdException w:name="Colorful Grid Accent 2" w:uiPriority="73" w:semiHidden="0" w:unhideWhenUsed="0"/>
+    <w:lsdException w:name="Light Shading Accent 3" w:uiPriority="60" w:semiHidden="0" w:unhideWhenUsed="0"/>
+    <w:lsdException w:name="Light List Accent 3" w:uiPriority="61" w:semiHidden="0" w:unhideWhenUsed="0"/>
+    <w:lsdException w:name="Light Grid Accent 3" w:uiPriority="62" w:semiHidden="0" w:unhideWhenUsed="0"/>
+    <w:lsdException w:name="Medium Shading 1 Accent 3" w:uiPriority="63" w:semiHidden="0" w:unhideWhenUsed="0"/>
+    <w:lsdException w:name="Medium Shading 2 Accent 3" w:uiPriority="64" w:semiHidden="0" w:unhideWhenUsed="0"/>
+    <w:lsdException w:name="Medium List 1 Accent 3" w:uiPriority="65" w:semiHidden="0" w:unhideWhenUsed="0"/>
+    <w:lsdException w:name="Medium List 2 Accent 3" w:uiPriority="66" w:semiHidden="0" w:unhideWhenUsed="0"/>
+    <w:lsdException w:name="Medium Grid 1 Accent 3" w:uiPriority="67" w:semiHidden="0" w:unhideWhenUsed="0"/>
+    <w:lsdException w:name="Medium Grid 2 Accent 3" w:uiPriority="68" w:semiHidden="0" w:unhideWhenUsed="0"/>
+    <w:lsdException w:name="Medium Grid 3 Accent 3" w:uiPriority="69" w:semiHidden="0" w:unhideWhenUsed="0"/>
+    <w:lsdException w:name="Dark List Accent 3" w:uiPriority="70" w:semiHidden="0" w:unhideWhenUsed="0"/>
+    <w:lsdException w:name="Colorful Shading Accent 3" w:uiPriority="71" w:semiHidden="0" w:unhideWhenUsed="0"/>
+    <w:lsdException w:name="Colorful List Accent 3" w:uiPriority="72" w:semiHidden="0" w:unhideWhenUsed="0"/>
+    <w:lsdException w:name="Colorful Grid Accent 3" w:uiPriority="73" w:semiHidden="0" w:unhideWhenUsed="0"/>
+    <w:lsdException w:name="Light Shading Accent 4" w:uiPriority="60" w:semiHidden="0" w:unhideWhenUsed="0"/>
+    <w:lsdException w:name="Light List Accent 4" w:uiPriority="61" w:semiHidden="0" w:unhideWhenUsed="0"/>
+    <w:lsdException w:name="Light Grid Accent 4" w:uiPriority="62" w:semiHidden="0" w:unhideWhenUsed="0"/>
+    <w:lsdException w:name="Medium Shading 1 Accent 4" w:uiPriority="63" w:semiHidden="0" w:unhideWhenUsed="0"/>
+    <w:lsdException w:name="Medium Shading 2 Accent 4" w:uiPriority="64" w:semiHidden="0" w:unhideWhenUsed="0"/>
+    <w:lsdException w:name="Medium List 1 Accent 4" w:uiPriority="65" w:semiHidden="0" w:unhideWhenUsed="0"/>
+    <w:lsdException w:name="Medium List 2 Accent 4" w:uiPriority="66" w:semiHidden="0" w:unhideWhenUsed="0"/>
+    <w:lsdException w:name="Medium Grid 1 Accent 4" w:uiPriority="67" w:semiHidden="0" w:unhideWhenUsed="0"/>
+    <w:lsdException w:name="Medium Grid 2 Accent 4" w:uiPriority="68" w:semiHidden="0" w:unhideWhenUsed="0"/>
+    <w:lsdException w:name="Medium Grid 3 Accent 4" w:uiPriority="69" w:semiHidden="0" w:unhideWhenUsed="0"/>
+    <w:lsdException w:name="Dark List Accent 4" w:uiPriority="70" w:semiHidden="0" w:unhideWhenUsed="0"/>
+    <w:lsdException w:name="Colorful Shading Accent 4" w:uiPriority="71" w:semiHidden="0" w:unhideWhenUsed="0"/>
+    <w:lsdException w:name="Colorful List Accent 4" w:uiPriority="72" w:semiHidden="0" w:unhideWhenUsed="0"/>
+    <w:lsdException w:name="Colorful Grid Accent 4" w:uiPriority="73" w:semiHidden="0" w:unhideWhenUsed="0"/>
+    <w:lsdException w:name="Light Shading Accent 5" w:uiPriority="60" w:semiHidden="0" w:unhideWhenUsed="0"/>
+    <w:lsdException w:name="Light List Accent 5" w:uiPriority="61" w:semiHidden="0" w:unhideWhenUsed="0"/>
+    <w:lsdException w:name="Light Grid Accent 5" w:uiPriority="62" w:semiHidden="0" w:unhideWhenUsed="0"/>
+    <w:lsdException w:name="Medium Shading 1 Accent 5" w:uiPriority="63" w:semiHidden="0" w:unhideWhenUsed="0"/>
+    <w:lsdException w:name="Medium Shading 2 Accent 5" w:uiPriority="64" w:semiHidden="0" w:unhideWhenUsed="0"/>
+    <w:lsdException w:name="Medium List 1 Accent 5" w:uiPriority="65" w:semiHidden="0" w:unhideWhenUsed="0"/>
+    <w:lsdException w:name="Medium List 2 Accent 5" w:uiPriority="66" w:semiHidden="0" w:unhideWhenUsed="0"/>
+    <w:lsdException w:name="Medium Grid 1 Accent 5" w:uiPriority="67" w:semiHidden="0" w:unhideWhenUsed="0"/>
+    <w:lsdException w:name="Medium Grid 2 Accent 5" w:uiPriority="68" w:semiHidden="0" w:unhideWhenUsed="0"/>
+    <w:lsdException w:name="Medium Grid 3 Accent 5" w:uiPriority="69" w:semiHidden="0" w:unhideWhenUsed="0"/>
+    <w:lsdException w:name="Dark List Accent 5" w:uiPriority="70" w:semiHidden="0" w:unhideWhenUsed="0"/>
+    <w:lsdException w:name="Colorful Shading Accent 5" w:uiPriority="71" w:semiHidden="0" w:unhideWhenUsed="0"/>
+    <w:lsdException w:name="Colorful List Accent 5" w:uiPriority="72" w:semiHidden="0" w:unhideWhenUsed="0"/>
+    <w:lsdException w:name="Colorful Grid Accent 5" w:uiPriority="73" w:semiHidden="0" w:unhideWhenUsed="0"/>
+    <w:lsdException w:name="Light Shading Accent 6" w:uiPriority="60" w:semiHidden="0" w:unhideWhenUsed="0"/>
+    <w:lsdException w:name="Light List Accent 6" w:uiPriority="61" w:semiHidden="0" w:unhideWhenUsed="0"/>
+    <w:lsdException w:name="Light Grid Accent 6" w:uiPriority="62" w:semiHidden="0" w:unhideWhenUsed="0"/>
+    <w:lsdException w:name="Medium Shading 1 Accent 6" w:uiPriority="63" w:semiHidden="0" w:unhideWhenUsed="0"/>
+    <w:lsdException w:name="Medium Shading 2 Accent 6" w:uiPriority="64" w:semiHidden="0" w:unhideWhenUsed="0"/>
+    <w:lsdException w:name="Medium List 1 Accent 6" w:uiPriority="65" w:semiHidden="0" w:unhideWhenUsed="0"/>
+    <w:lsdException w:name="Medium List 2 Accent 6" w:uiPriority="66" w:semiHidden="0" w:unhideWhenUsed="0"/>
+    <w:lsdException w:name="Medium Grid 1 Accent 6" w:uiPriority="67" w:semiHidden="0" w:unhideWhenUsed="0"/>
+    <w:lsdException w:name="Medium Grid 2 Accent 6" w:uiPriority="68" w:semiHidden="0" w:unhideWhenUsed="0"/>
+    <w:lsdException w:name="Medium Grid 3 Accent 6" w:uiPriority="69" w:semiHidden="0" w:unhideWhenUsed="0"/>
+    <w:lsdException w:name="Dark List Accent 6" w:uiPriority="70" w:semiHidden="0" w:unhideWhenUsed="0"/>
+    <w:lsdException w:name="Colorful Shading Accent 6" w:uiPriority="71" w:semiHidden="0" w:unhideWhenUsed="0"/>
+    <w:lsdException w:name="Colorful List Accent 6" w:uiPriority="72" w:semiHidden="0" w:unhideWhenUsed="0"/>
+    <w:lsdException w:name="Colorful Grid Accent 6" w:uiPriority="73" w:semiHidden="0" w:unhideWhenUsed="0"/>
+    <w:lsdException w:name="Subtle Emphasis" w:uiPriority="19" w:semiHidden="0" w:unhideWhenUsed="0" w:qFormat="1"/>
+    <w:lsdException w:name="Intense Emphasis" w:uiPriority="21" w:semiHidden="0" w:unhideWhenUsed="0" w:qFormat="1"/>
+    <w:lsdException w:name="Subtle Reference" w:uiPriority="31" w:semiHidden="0" w:unhideWhenUsed="0" w:qFormat="1"/>
+    <w:lsdException w:name="Intense Reference" w:uiPriority="32" w:semiHidden="0" w:unhideWhenUsed="0" w:qFormat="1"/>
+    <w:lsdException w:name="Book Title" w:uiPriority="33" w:semiHidden="0" w:unhideWhenUsed="0" w:qFormat="1"/>
     <w:lsdException w:name="Bibliography" w:uiPriority="37"/>
     <w:lsdException w:name="TOC Heading" w:uiPriority="39" w:qFormat="1"/>
   </w:latentStyles>
-  <w:style w:type="paragraph" w:default="1" w:styleId="a">
+  <w:style xmlns:mc="http://schemas.openxmlformats.org/markup-compatibility/2006" xmlns:r="http://schemas.openxmlformats.org/officeDocument/2006/relationships" xmlns:w="http://schemas.openxmlformats.org/wordprocessingml/2006/main" xmlns:w14="http://schemas.microsoft.com/office/word/2010/wordml" w:type="paragraph" w:styleId="a" w:default="1">
     <w:name w:val="Normal"/>
     <w:qFormat/>
   </w:style>
-  <w:style w:type="table" w:default="1" w:styleId="a1">
+  <w:style xmlns:mc="http://schemas.openxmlformats.org/markup-compatibility/2006" xmlns:r="http://schemas.openxmlformats.org/officeDocument/2006/relationships" xmlns:w="http://schemas.openxmlformats.org/wordprocessingml/2006/main" xmlns:w14="http://schemas.microsoft.com/office/word/2010/wordml" w:type="table" w:styleId="a1" w:default="1">
     <w:name w:val="Normal Table"/>
     <w:uiPriority w:val="99"/>
     <w:semiHidden/>
@@ -193,13 +193,13 @@
       </w:tblCellMar>
     </w:tblPr>
   </w:style>
-  <w:style w:type="numbering" w:default="1" w:styleId="a2">
+  <w:style xmlns:mc="http://schemas.openxmlformats.org/markup-compatibility/2006" xmlns:r="http://schemas.openxmlformats.org/officeDocument/2006/relationships" xmlns:w="http://schemas.openxmlformats.org/wordprocessingml/2006/main" xmlns:w14="http://schemas.microsoft.com/office/word/2010/wordml" w:type="numbering" w:styleId="a2" w:default="1">
     <w:name w:val="No List"/>
     <w:uiPriority w:val="99"/>
     <w:semiHidden/>
     <w:unhideWhenUsed/>
   </w:style>
-  <w:style w:type="paragraph" w:styleId="a7">
+  <w:style xmlns:mc="http://schemas.openxmlformats.org/markup-compatibility/2006" xmlns:r="http://schemas.openxmlformats.org/officeDocument/2006/relationships" xmlns:w="http://schemas.openxmlformats.org/wordprocessingml/2006/main" xmlns:w14="http://schemas.microsoft.com/office/word/2010/wordml" w:type="paragraph" w:styleId="a7">
     <w:name w:val="No Spacing"/>
     <w:basedOn w:val="a"/>
     <w:uiPriority w:val="1"/>
@@ -208,7 +208,7 @@
       <w:spacing w:after="0" w:line="240" w:lineRule="auto"/>
     </w:pPr>
   </w:style>
-  <w:style w:type="paragraph" w:styleId="af5">
+  <w:style xmlns:mc="http://schemas.openxmlformats.org/markup-compatibility/2006" xmlns:r="http://schemas.openxmlformats.org/officeDocument/2006/relationships" xmlns:w="http://schemas.openxmlformats.org/wordprocessingml/2006/main" xmlns:w14="http://schemas.microsoft.com/office/word/2010/wordml" w:type="paragraph" w:styleId="af5">
     <w:name w:val="List Paragraph"/>
     <w:basedOn w:val="a"/>
     <w:uiPriority w:val="34"/>

</xml_diff>